<commit_message>
Rename documentation file to Week 1-3
</commit_message>
<xml_diff>
--- a/WEEK 1-5(BIT 4139 , documentaion).docx
+++ b/WEEK 1-5(BIT 4139 , documentaion).docx
@@ -521,7 +521,16 @@
                 <w:bCs/>
                 <w:spacing w:val="-2"/>
               </w:rPr>
-              <w:t>BIT4138</w:t>
+              <w:t>BIT413</w:t>
+            </w:r>
+            <w:r>
+              <w:rPr>
+                <w:rFonts w:ascii="Arial MT"/>
+                <w:b/>
+                <w:bCs/>
+                <w:spacing w:val="-2"/>
+              </w:rPr>
+              <w:t>9</w:t>
             </w:r>
           </w:p>
         </w:tc>
@@ -5312,11 +5321,11 @@
         </w:rPr>
       </w:pPr>
     </w:p>
-    <w:bookmarkStart w:id="4" w:name="_Toc232090809"/>
     <w:p>
       <w:pPr>
         <w:pStyle w:val="Heading2"/>
       </w:pPr>
+      <w:bookmarkStart w:id="4" w:name="_Toc232090809"/>
       <w:r>
         <w:rPr>
           <w:noProof/>
@@ -5420,34 +5429,16 @@
                       <w:r>
                         <w:t xml:space="preserve">Figure </w:t>
                       </w:r>
+                      <w:fldSimple w:instr=" SEQ Figure \* ARABIC ">
+                        <w:r>
+                          <w:rPr>
+                            <w:noProof/>
+                          </w:rPr>
+                          <w:t>1</w:t>
+                        </w:r>
+                      </w:fldSimple>
                       <w:r>
-                        <w:fldChar w:fldCharType="begin"/>
-                      </w:r>
-                      <w:r>
-                        <w:instrText xml:space="preserve"> SEQ Figure \* ARABIC </w:instrText>
-                      </w:r>
-                      <w:r>
-                        <w:fldChar w:fldCharType="separate"/>
-                      </w:r>
-                      <w:r>
-                        <w:rPr>
-                          <w:noProof/>
-                        </w:rPr>
-                        <w:t>1</w:t>
-                      </w:r>
-                      <w:r>
-                        <w:fldChar w:fldCharType="end"/>
-                      </w:r>
-                      <w:r>
-                        <w:t xml:space="preserve">kali </w:t>
-                      </w:r>
-                      <w:proofErr w:type="spellStart"/>
-                      <w:r>
-                        <w:t>linux</w:t>
-                      </w:r>
-                      <w:proofErr w:type="spellEnd"/>
-                      <w:r>
-                        <w:t xml:space="preserve"> OS running on virtual box</w:t>
+                        <w:t>kali linux OS running on virtual box</w:t>
                       </w:r>
                     </w:p>
                   </w:txbxContent>
@@ -5749,7 +5740,7 @@
           <w:noProof/>
         </w:rPr>
         <w:drawing>
-          <wp:anchor distT="0" distB="0" distL="114300" distR="114300" simplePos="0" relativeHeight="251660288" behindDoc="0" locked="0" layoutInCell="1" allowOverlap="1" wp14:anchorId="7AE1D698" wp14:editId="67B8F732">
+          <wp:anchor distT="0" distB="0" distL="114300" distR="114300" simplePos="0" relativeHeight="251660288" behindDoc="0" locked="0" layoutInCell="1" allowOverlap="1" wp14:anchorId="7AE1D698" wp14:editId="7CF18FEC">
             <wp:simplePos x="0" y="0"/>
             <wp:positionH relativeFrom="column">
               <wp:posOffset>213360</wp:posOffset>
@@ -6622,7 +6613,7 @@
           <w:noProof/>
         </w:rPr>
         <w:drawing>
-          <wp:anchor distT="0" distB="0" distL="114300" distR="114300" simplePos="0" relativeHeight="251664384" behindDoc="0" locked="0" layoutInCell="1" allowOverlap="1" wp14:anchorId="575E1D04" wp14:editId="0CFD2D21">
+          <wp:anchor distT="0" distB="0" distL="114300" distR="114300" simplePos="0" relativeHeight="251664384" behindDoc="0" locked="0" layoutInCell="1" allowOverlap="1" wp14:anchorId="575E1D04" wp14:editId="49CA9CE3">
             <wp:simplePos x="0" y="0"/>
             <wp:positionH relativeFrom="column">
               <wp:posOffset>-236220</wp:posOffset>
@@ -9615,12 +9606,12 @@
     <w:p/>
     <w:p/>
     <w:p/>
-    <w:bookmarkStart w:id="25" w:name="_Toc232090823"/>
     <w:p>
       <w:pPr>
         <w:pStyle w:val="Heading2"/>
         <w:ind w:left="0"/>
       </w:pPr>
+      <w:bookmarkStart w:id="25" w:name="_Toc232090823"/>
       <w:r>
         <w:rPr>
           <w:b w:val="0"/>
@@ -10600,7 +10591,7 @@
           <w:noProof/>
         </w:rPr>
         <w:drawing>
-          <wp:inline distT="0" distB="0" distL="0" distR="0" wp14:anchorId="77C3F9B7" wp14:editId="07060512">
+          <wp:inline distT="0" distB="0" distL="0" distR="0" wp14:anchorId="77C3F9B7" wp14:editId="24AE3241">
             <wp:extent cx="6400800" cy="3446145"/>
             <wp:effectExtent l="0" t="0" r="0" b="1905"/>
             <wp:docPr id="867411658" name="Picture 11"/>
@@ -10913,7 +10904,7 @@
           <w:noProof/>
         </w:rPr>
         <w:drawing>
-          <wp:anchor distT="0" distB="0" distL="114300" distR="114300" simplePos="0" relativeHeight="487602688" behindDoc="0" locked="0" layoutInCell="1" allowOverlap="1" wp14:anchorId="37FADCEA" wp14:editId="6FD2DA1A">
+          <wp:anchor distT="0" distB="0" distL="114300" distR="114300" simplePos="0" relativeHeight="487602688" behindDoc="0" locked="0" layoutInCell="1" allowOverlap="1" wp14:anchorId="37FADCEA" wp14:editId="6BAB4620">
             <wp:simplePos x="0" y="0"/>
             <wp:positionH relativeFrom="column">
               <wp:posOffset>-153035</wp:posOffset>

</xml_diff>